<commit_message>
Atualização do codeVersion android para 30
</commit_message>
<xml_diff>
--- a/Documentação/Sistema de Cálculo da Elétrica Residencial.docx
+++ b/Documentação/Sistema de Cálculo da Elétrica Residencial.docx
@@ -1763,18 +1763,19 @@
     </w:p>
     <w:p>
       <w:pPr>
-        <w:spacing w:after="0"/>
-        <w:rPr>
-          <w:b/>
-          <w:sz w:val="32"/>
-          <w:szCs w:val="32"/>
-        </w:rPr>
-      </w:pPr>
-      <w:r>
-        <w:rPr>
-          <w:b/>
-          <w:sz w:val="32"/>
-          <w:szCs w:val="32"/>
+        <w:spacing w:before="240"/>
+        <w:jc w:val="both"/>
+        <w:rPr>
+          <w:b/>
+          <w:sz w:val="36"/>
+          <w:szCs w:val="36"/>
+        </w:rPr>
+      </w:pPr>
+      <w:r>
+        <w:rPr>
+          <w:b/>
+          <w:sz w:val="36"/>
+          <w:szCs w:val="36"/>
         </w:rPr>
         <w:t xml:space="preserve">Parte 3: Perguntas Frequentes (FAQ) </w:t>
       </w:r>
@@ -1872,6 +1873,12 @@
     </w:p>
     <w:p>
       <w:pPr>
+        <w:ind w:left="1068"/>
+        <w:jc w:val="both"/>
+      </w:pPr>
+    </w:p>
+    <w:p>
+      <w:pPr>
         <w:spacing w:before="240"/>
         <w:jc w:val="both"/>
         <w:rPr>
@@ -1886,6 +1893,7 @@
           <w:sz w:val="36"/>
           <w:szCs w:val="36"/>
         </w:rPr>
+        <w:lastRenderedPageBreak/>
         <w:t xml:space="preserve">Parte </w:t>
       </w:r>
       <w:r>
@@ -1896,8 +1904,6 @@
         </w:rPr>
         <w:t>4</w:t>
       </w:r>
-      <w:bookmarkStart w:id="0" w:name="_GoBack"/>
-      <w:bookmarkEnd w:id="0"/>
       <w:r>
         <w:rPr>
           <w:b/>
@@ -1934,47 +1940,21 @@
     </w:p>
     <w:p>
       <w:pPr>
+        <w:pStyle w:val="PargrafodaLista"/>
         <w:spacing w:after="0"/>
-        <w:jc w:val="both"/>
-        <w:rPr>
-          <w:rFonts w:eastAsia="Times New Roman"/>
-          <w:bCs/>
-          <w:sz w:val="32"/>
-          <w:szCs w:val="32"/>
-        </w:rPr>
-      </w:pPr>
-      <w:r>
-        <w:rPr>
-          <w:rFonts w:eastAsia="Times New Roman"/>
-          <w:bCs/>
-        </w:rPr>
-        <w:lastRenderedPageBreak/>
+        <w:ind w:left="360"/>
+        <w:jc w:val="both"/>
+      </w:pPr>
+      <w:r>
         <w:t>O Perímetro é a soma de todos os lados (paredes) do cômodo, medido em metros lineares (m). No contexto da norma NBR 5410, enquanto a Área determina a potência da iluminação, o Perímetro é o dado fundamental para definir a quantidade mínima de tomadas de uso geral (</w:t>
       </w:r>
       <w:proofErr w:type="spellStart"/>
       <w:r>
-        <w:rPr>
-          <w:rFonts w:eastAsia="Times New Roman"/>
-          <w:bCs/>
-        </w:rPr>
         <w:t>TUGs</w:t>
       </w:r>
       <w:proofErr w:type="spellEnd"/>
       <w:r>
-        <w:rPr>
-          <w:rFonts w:eastAsia="Times New Roman"/>
-          <w:bCs/>
-        </w:rPr>
-        <w:t>) por segurança, evitando o uso de benjamins e extensões.</w:t>
-      </w:r>
-      <w:r>
-        <w:rPr>
-          <w:rFonts w:eastAsia="Times New Roman"/>
-          <w:bCs/>
-          <w:sz w:val="32"/>
-          <w:szCs w:val="32"/>
-        </w:rPr>
-        <w:t xml:space="preserve"> </w:t>
+        <w:t xml:space="preserve">) por segurança, evitando o uso de benjamins e extensões. </w:t>
       </w:r>
     </w:p>
     <w:p>
@@ -2076,18 +2056,12 @@
     </w:p>
     <w:p>
       <w:pPr>
+        <w:pStyle w:val="PargrafodaLista"/>
         <w:spacing w:after="0"/>
-        <w:jc w:val="both"/>
-        <w:rPr>
-          <w:rFonts w:eastAsia="Times New Roman"/>
-          <w:bCs/>
-        </w:rPr>
-      </w:pPr>
-      <w:r>
-        <w:rPr>
-          <w:rFonts w:eastAsia="Times New Roman"/>
-          <w:bCs/>
-        </w:rPr>
+        <w:ind w:left="360"/>
+        <w:jc w:val="both"/>
+      </w:pPr>
+      <w:r>
         <w:t>O Brasil divide-se em dois grandes blocos de distribuição:</w:t>
       </w:r>
     </w:p>
@@ -2204,7 +2178,41 @@
     </w:p>
     <w:p>
       <w:pPr>
+        <w:pStyle w:val="PargrafodaLista"/>
         <w:spacing w:after="0"/>
+        <w:ind w:left="360"/>
+        <w:jc w:val="both"/>
+      </w:pPr>
+      <w:r>
+        <w:t>O motor de cálculo atua como um "fiscal da concessionária" muito rigoroso para ligações no poste da rua. Para uma casa, se a carga passa de 25 kW (</w:t>
+      </w:r>
+      <w:proofErr w:type="spellStart"/>
+      <w:r>
+        <w:t>ex</w:t>
+      </w:r>
+      <w:proofErr w:type="spellEnd"/>
+      <w:r>
+        <w:t>: 28.148 VA), a distribuidora corta o bifásico e obriga a colocar o trifásico para não desequilibrar a rua (sugerindo cabos de 25 mm2 e Disjuntor de 80 A).</w:t>
+      </w:r>
+    </w:p>
+    <w:p>
+      <w:pPr>
+        <w:pStyle w:val="PargrafodaLista"/>
+        <w:spacing w:after="0"/>
+        <w:ind w:left="360"/>
+        <w:jc w:val="both"/>
+      </w:pPr>
+      <w:r>
+        <w:t>No entanto, no apartamento a realidade é outra devido a dois conceitos:</w:t>
+      </w:r>
+    </w:p>
+    <w:p>
+      <w:pPr>
+        <w:pStyle w:val="PargrafodaLista"/>
+        <w:numPr>
+          <w:ilvl w:val="0"/>
+          <w:numId w:val="11"/>
+        </w:numPr>
         <w:jc w:val="both"/>
         <w:rPr>
           <w:rFonts w:eastAsia="Times New Roman"/>
@@ -2216,51 +2224,58 @@
           <w:rFonts w:eastAsia="Times New Roman"/>
           <w:bCs/>
         </w:rPr>
-        <w:t>O motor de cálculo atua como um "fiscal da concessionária" muito rigoroso para ligações no</w:t>
-      </w:r>
+        <w:t>A Regra do Prédio: O prédio recebe energia Trifásica pesada. O engenheiro distribui as três fases alternadamente pelos andares (</w:t>
+      </w:r>
+      <w:proofErr w:type="spellStart"/>
       <w:r>
         <w:rPr>
           <w:rFonts w:eastAsia="Times New Roman"/>
           <w:bCs/>
         </w:rPr>
-        <w:t xml:space="preserve"> </w:t>
-      </w:r>
+        <w:t>ex</w:t>
+      </w:r>
+      <w:proofErr w:type="spellEnd"/>
       <w:r>
         <w:rPr>
           <w:rFonts w:eastAsia="Times New Roman"/>
           <w:bCs/>
         </w:rPr>
-        <w:t>poste da rua. Para uma casa, se a carga passa de 25 kW (</w:t>
-      </w:r>
-      <w:proofErr w:type="spellStart"/>
-      <w:r>
+        <w:t>: Apto 11 recebe Fases A e B). Por isso, mesmo que a carga passe dos 25 kW, o projeto interno permite manter a unidade como bifásica, pois o equilíbrio é feito no conjunto do prédio.</w:t>
+      </w:r>
+    </w:p>
+    <w:p>
+      <w:pPr>
+        <w:pStyle w:val="PargrafodaLista"/>
+        <w:numPr>
+          <w:ilvl w:val="0"/>
+          <w:numId w:val="11"/>
+        </w:numPr>
+        <w:jc w:val="both"/>
         <w:rPr>
           <w:rFonts w:eastAsia="Times New Roman"/>
           <w:bCs/>
         </w:rPr>
-        <w:t>ex</w:t>
-      </w:r>
-      <w:proofErr w:type="spellEnd"/>
+      </w:pPr>
       <w:r>
         <w:rPr>
           <w:rFonts w:eastAsia="Times New Roman"/>
           <w:bCs/>
         </w:rPr>
-        <w:t>: 28.148 VA), a distribuidora corta</w:t>
+        <w:t xml:space="preserve">O Fator de Simultaneidade Real e a Seletividade: Um disjuntor Bifásico de 70A a </w:t>
       </w:r>
       <w:r>
         <w:rPr>
           <w:rFonts w:eastAsia="Times New Roman"/>
           <w:bCs/>
         </w:rPr>
-        <w:t xml:space="preserve"> </w:t>
+        <w:t>22</w:t>
       </w:r>
       <w:r>
         <w:rPr>
           <w:rFonts w:eastAsia="Times New Roman"/>
           <w:bCs/>
         </w:rPr>
-        <w:t>o bifásico e obriga a colocar o trifásico para não desequilibrar a rua (sugerindo cabos de 25</w:t>
+        <w:t>0V suporta 15.400 VA. A demanda diária raramente atinge a carga total instalada (ninguém liga todos os chuveiros e ares-condicionados no mesmo segundo). Por isso o disjuntor de 70A e o cabo de 10 mm2 funcionam perfeitamente na prática, pois a corrente de uso costuma flutuar entre 30A e 50A. Além disso, o disjuntor do medidor (70A) é maior que o interno (63A) por Seletividade, garantindo que o</w:t>
       </w:r>
       <w:r>
         <w:rPr>
@@ -2274,12 +2289,179 @@
           <w:rFonts w:eastAsia="Times New Roman"/>
           <w:bCs/>
         </w:rPr>
-        <w:t>mm2 e Disjuntor de 80 A).</w:t>
-      </w:r>
-    </w:p>
-    <w:p>
-      <w:pPr>
+        <w:t>desarme aconteça dentro de casa em caso de pico extremo.</w:t>
+      </w:r>
+    </w:p>
+    <w:p>
+      <w:pPr>
+        <w:pStyle w:val="PargrafodaLista"/>
+        <w:spacing w:before="160" w:after="0"/>
+        <w:ind w:left="360"/>
+        <w:jc w:val="both"/>
+      </w:pPr>
+    </w:p>
+    <w:p>
+      <w:pPr>
+        <w:spacing w:before="240"/>
+        <w:jc w:val="both"/>
+        <w:rPr>
+          <w:b/>
+          <w:sz w:val="36"/>
+          <w:szCs w:val="36"/>
+        </w:rPr>
+      </w:pPr>
+    </w:p>
+    <w:p>
+      <w:pPr>
+        <w:spacing w:before="240"/>
+        <w:jc w:val="both"/>
+        <w:rPr>
+          <w:b/>
+          <w:sz w:val="36"/>
+          <w:szCs w:val="36"/>
+        </w:rPr>
+      </w:pPr>
+    </w:p>
+    <w:p>
+      <w:pPr>
+        <w:spacing w:before="240"/>
+        <w:jc w:val="both"/>
+        <w:rPr>
+          <w:b/>
+          <w:sz w:val="36"/>
+          <w:szCs w:val="36"/>
+        </w:rPr>
+      </w:pPr>
+      <w:r>
+        <w:rPr>
+          <w:b/>
+          <w:sz w:val="36"/>
+          <w:szCs w:val="36"/>
+        </w:rPr>
+        <w:lastRenderedPageBreak/>
+        <w:t xml:space="preserve">Parte </w:t>
+      </w:r>
+      <w:r>
+        <w:rPr>
+          <w:b/>
+          <w:sz w:val="36"/>
+          <w:szCs w:val="36"/>
+        </w:rPr>
+        <w:t>5</w:t>
+      </w:r>
+      <w:r>
+        <w:rPr>
+          <w:b/>
+          <w:sz w:val="36"/>
+          <w:szCs w:val="36"/>
+        </w:rPr>
+        <w:t>: Aba Guia Prático (Soluções de Campo)</w:t>
+      </w:r>
+    </w:p>
+    <w:p>
+      <w:pPr>
+        <w:pStyle w:val="PargrafodaLista"/>
         <w:spacing w:after="0"/>
+        <w:ind w:left="360"/>
+        <w:jc w:val="both"/>
+      </w:pPr>
+      <w:r>
+        <w:t>Esta nova aba foi desenvolvida para ser o "canivete suíço" do eletricista no dia a dia da obra, oferecendo consultas rápidas, alertas de segurança e referências visuais de montagem.</w:t>
+      </w:r>
+    </w:p>
+    <w:p>
+      <w:pPr>
+        <w:pStyle w:val="PargrafodaLista"/>
+        <w:spacing w:after="0"/>
+        <w:ind w:left="360"/>
+        <w:jc w:val="center"/>
+      </w:pPr>
+      <w:r>
+        <w:drawing>
+          <wp:inline distT="0" distB="0" distL="0" distR="0" wp14:anchorId="46032CB9" wp14:editId="475C3827">
+            <wp:extent cx="1457184" cy="2524125"/>
+            <wp:effectExtent l="0" t="0" r="0" b="0"/>
+            <wp:docPr id="3" name="Imagem 3"/>
+            <wp:cNvGraphicFramePr>
+              <a:graphicFrameLocks xmlns:a="http://schemas.openxmlformats.org/drawingml/2006/main" noChangeAspect="1"/>
+            </wp:cNvGraphicFramePr>
+            <a:graphic xmlns:a="http://schemas.openxmlformats.org/drawingml/2006/main">
+              <a:graphicData uri="http://schemas.openxmlformats.org/drawingml/2006/picture">
+                <pic:pic xmlns:pic="http://schemas.openxmlformats.org/drawingml/2006/picture">
+                  <pic:nvPicPr>
+                    <pic:cNvPr id="1" name=""/>
+                    <pic:cNvPicPr/>
+                  </pic:nvPicPr>
+                  <pic:blipFill>
+                    <a:blip r:embed="rId23"/>
+                    <a:stretch>
+                      <a:fillRect/>
+                    </a:stretch>
+                  </pic:blipFill>
+                  <pic:spPr>
+                    <a:xfrm>
+                      <a:off x="0" y="0"/>
+                      <a:ext cx="1469718" cy="2545837"/>
+                    </a:xfrm>
+                    <a:prstGeom prst="rect">
+                      <a:avLst/>
+                    </a:prstGeom>
+                  </pic:spPr>
+                </pic:pic>
+              </a:graphicData>
+            </a:graphic>
+          </wp:inline>
+        </w:drawing>
+      </w:r>
+      <w:r>
+        <w:t xml:space="preserve">    </w:t>
+      </w:r>
+    </w:p>
+    <w:p>
+      <w:pPr>
+        <w:pStyle w:val="PargrafodaLista"/>
+        <w:numPr>
+          <w:ilvl w:val="0"/>
+          <w:numId w:val="18"/>
+        </w:numPr>
+        <w:spacing w:after="0"/>
+        <w:jc w:val="both"/>
+      </w:pPr>
+      <w:r>
+        <w:rPr>
+          <w:b/>
+        </w:rPr>
+        <w:t>Dimensionamento Inteligente (Recomendação Base)</w:t>
+      </w:r>
+      <w:r>
+        <w:t xml:space="preserve"> </w:t>
+      </w:r>
+    </w:p>
+    <w:p>
+      <w:pPr>
+        <w:pStyle w:val="PargrafodaLista"/>
+        <w:spacing w:after="0"/>
+        <w:jc w:val="both"/>
+      </w:pPr>
+      <w:r>
+        <w:t xml:space="preserve">Ao preencher os dados do seu projeto nas abas Cômodos e </w:t>
+      </w:r>
+      <w:proofErr w:type="spellStart"/>
+      <w:r>
+        <w:t>TUEs</w:t>
+      </w:r>
+      <w:proofErr w:type="spellEnd"/>
+      <w:r>
+        <w:t>, a aba Guia Prático calcula automaticamente uma recomendação de segurança contendo:</w:t>
+      </w:r>
+    </w:p>
+    <w:p>
+      <w:pPr>
+        <w:pStyle w:val="PargrafodaLista"/>
+        <w:numPr>
+          <w:ilvl w:val="0"/>
+          <w:numId w:val="11"/>
+        </w:numPr>
         <w:jc w:val="both"/>
         <w:rPr>
           <w:rFonts w:eastAsia="Times New Roman"/>
@@ -2289,9 +2471,17 @@
       <w:r>
         <w:rPr>
           <w:rFonts w:eastAsia="Times New Roman"/>
+          <w:b/>
           <w:bCs/>
         </w:rPr>
-        <w:t>No entanto, no apartamento a realidade é outra devido a dois conceitos:</w:t>
+        <w:t>Disjuntor Geral:</w:t>
+      </w:r>
+      <w:r>
+        <w:rPr>
+          <w:rFonts w:eastAsia="Times New Roman"/>
+          <w:bCs/>
+        </w:rPr>
+        <w:t xml:space="preserve"> A amperagem base para a proteção do circuito.</w:t>
       </w:r>
     </w:p>
     <w:p>
@@ -2299,22 +2489,190 @@
         <w:pStyle w:val="PargrafodaLista"/>
         <w:numPr>
           <w:ilvl w:val="0"/>
-          <w:numId w:val="14"/>
+          <w:numId w:val="11"/>
+        </w:numPr>
+        <w:jc w:val="both"/>
+        <w:rPr>
+          <w:rFonts w:eastAsia="Times New Roman"/>
+          <w:bCs/>
+        </w:rPr>
+      </w:pPr>
+      <w:r>
+        <w:rPr>
+          <w:rFonts w:eastAsia="Times New Roman"/>
+          <w:b/>
+          <w:bCs/>
+        </w:rPr>
+        <w:t>IDR recomendado</w:t>
+      </w:r>
+      <w:r>
+        <w:rPr>
+          <w:rFonts w:eastAsia="Times New Roman"/>
+          <w:b/>
+          <w:bCs/>
+        </w:rPr>
+        <w:t>:</w:t>
+      </w:r>
+      <w:r>
+        <w:rPr>
+          <w:rFonts w:eastAsia="Times New Roman"/>
+          <w:bCs/>
+        </w:rPr>
+        <w:t xml:space="preserve"> A corrente nominal mínima que o Interruptor Diferencial Residual deve ter para suportar a carga da casa sem desarmar.</w:t>
+      </w:r>
+    </w:p>
+    <w:p>
+      <w:pPr>
+        <w:pStyle w:val="PargrafodaLista"/>
+        <w:numPr>
+          <w:ilvl w:val="0"/>
+          <w:numId w:val="11"/>
+        </w:numPr>
+        <w:jc w:val="both"/>
+        <w:rPr>
+          <w:rFonts w:eastAsia="Times New Roman"/>
+          <w:bCs/>
+        </w:rPr>
+      </w:pPr>
+      <w:r>
+        <w:rPr>
+          <w:rFonts w:eastAsia="Times New Roman"/>
+          <w:b/>
+          <w:bCs/>
+        </w:rPr>
+        <w:t>DPS recomendado</w:t>
+      </w:r>
+      <w:r>
+        <w:rPr>
+          <w:rFonts w:eastAsia="Times New Roman"/>
+          <w:b/>
+          <w:bCs/>
+        </w:rPr>
+        <w:t>:</w:t>
+      </w:r>
+      <w:r>
+        <w:rPr>
+          <w:rFonts w:eastAsia="Times New Roman"/>
+          <w:bCs/>
+        </w:rPr>
+        <w:t xml:space="preserve"> A classe e a voltagem ideal do Dispositivo de Proteção contra Surtos (Ex</w:t>
+      </w:r>
+      <w:r>
+        <w:rPr>
+          <w:rFonts w:eastAsia="Times New Roman"/>
+          <w:bCs/>
+        </w:rPr>
+        <w:t>.</w:t>
+      </w:r>
+      <w:r>
+        <w:rPr>
+          <w:rFonts w:eastAsia="Times New Roman"/>
+          <w:bCs/>
+        </w:rPr>
+        <w:t>: 175V para redes 127V, ou 275V para redes 220V).</w:t>
+      </w:r>
+    </w:p>
+    <w:p>
+      <w:pPr>
+        <w:pStyle w:val="PargrafodaLista"/>
+        <w:numPr>
+          <w:ilvl w:val="0"/>
+          <w:numId w:val="11"/>
+        </w:numPr>
+        <w:jc w:val="both"/>
+        <w:rPr>
+          <w:rFonts w:eastAsia="Times New Roman"/>
+          <w:bCs/>
+        </w:rPr>
+      </w:pPr>
+      <w:r>
+        <w:rPr>
+          <w:rFonts w:eastAsia="Times New Roman"/>
+          <w:b/>
+          <w:bCs/>
+        </w:rPr>
+        <w:t>Nota:</w:t>
+      </w:r>
+      <w:r>
+        <w:rPr>
+          <w:rFonts w:eastAsia="Times New Roman"/>
+          <w:bCs/>
+        </w:rPr>
+        <w:t xml:space="preserve"> Esta seção só exibirá os resultados se você tiver adicionado ambientes e equipamentos nas abas anteriores.</w:t>
+      </w:r>
+    </w:p>
+    <w:p>
+      <w:pPr>
+        <w:ind w:left="708"/>
+        <w:jc w:val="center"/>
+        <w:rPr>
+          <w:rFonts w:eastAsia="Times New Roman"/>
+          <w:bCs/>
+        </w:rPr>
+      </w:pPr>
+      <w:r>
+        <w:drawing>
+          <wp:inline distT="0" distB="0" distL="0" distR="0" wp14:anchorId="5D59D218" wp14:editId="59DDD150">
+            <wp:extent cx="1497226" cy="2543175"/>
+            <wp:effectExtent l="0" t="0" r="8255" b="0"/>
+            <wp:docPr id="4" name="Imagem 4"/>
+            <wp:cNvGraphicFramePr>
+              <a:graphicFrameLocks xmlns:a="http://schemas.openxmlformats.org/drawingml/2006/main" noChangeAspect="1"/>
+            </wp:cNvGraphicFramePr>
+            <a:graphic xmlns:a="http://schemas.openxmlformats.org/drawingml/2006/main">
+              <a:graphicData uri="http://schemas.openxmlformats.org/drawingml/2006/picture">
+                <pic:pic xmlns:pic="http://schemas.openxmlformats.org/drawingml/2006/picture">
+                  <pic:nvPicPr>
+                    <pic:cNvPr id="1" name=""/>
+                    <pic:cNvPicPr/>
+                  </pic:nvPicPr>
+                  <pic:blipFill>
+                    <a:blip r:embed="rId24"/>
+                    <a:stretch>
+                      <a:fillRect/>
+                    </a:stretch>
+                  </pic:blipFill>
+                  <pic:spPr>
+                    <a:xfrm>
+                      <a:off x="0" y="0"/>
+                      <a:ext cx="1509890" cy="2564687"/>
+                    </a:xfrm>
+                    <a:prstGeom prst="rect">
+                      <a:avLst/>
+                    </a:prstGeom>
+                  </pic:spPr>
+                </pic:pic>
+              </a:graphicData>
+            </a:graphic>
+          </wp:inline>
+        </w:drawing>
+      </w:r>
+    </w:p>
+    <w:p>
+      <w:pPr>
+        <w:pStyle w:val="PargrafodaLista"/>
+        <w:numPr>
+          <w:ilvl w:val="0"/>
+          <w:numId w:val="18"/>
         </w:numPr>
         <w:spacing w:after="0"/>
-        <w:ind w:left="357" w:hanging="357"/>
-        <w:jc w:val="both"/>
-      </w:pPr>
-      <w:r>
-        <w:t>A Regra do Prédio: O prédio recebe energia Trifásica pesada. O engenheiro distribui as três fases alternadamente pelos andares (</w:t>
-      </w:r>
-      <w:proofErr w:type="spellStart"/>
-      <w:r>
-        <w:t>ex</w:t>
-      </w:r>
-      <w:proofErr w:type="spellEnd"/>
-      <w:r>
-        <w:t>: Apto 11 recebe Fases A e B). Por isso, mesmo que a carga passe dos 25 kW, o projeto interno permite manter a unidade como bifásica, pois o equilíbrio é feito no conjunto do prédio.</w:t>
+        <w:jc w:val="both"/>
+      </w:pPr>
+      <w:r>
+        <w:rPr>
+          <w:b/>
+        </w:rPr>
+        <w:t>Manuais Visuais e Situações do Dia a Dia</w:t>
+      </w:r>
+    </w:p>
+    <w:p>
+      <w:pPr>
+        <w:pStyle w:val="PargrafodaLista"/>
+        <w:spacing w:after="0"/>
+        <w:jc w:val="both"/>
+      </w:pPr>
+      <w:r>
+        <w:t>O guia traz quatro módulos de consulta rápida para resolver dúvidas comuns e elevar o padrão do seu serviço:</w:t>
       </w:r>
     </w:p>
     <w:p>
@@ -2322,26 +2680,277 @@
         <w:pStyle w:val="PargrafodaLista"/>
         <w:numPr>
           <w:ilvl w:val="0"/>
-          <w:numId w:val="14"/>
+          <w:numId w:val="11"/>
         </w:numPr>
-        <w:spacing w:before="160" w:after="0"/>
-        <w:jc w:val="both"/>
-      </w:pPr>
-      <w:r>
-        <w:t xml:space="preserve">O Fator de Simultaneidade Real e a Seletividade: Um disjuntor Bifásico de 70A a </w:t>
-      </w:r>
-      <w:r>
-        <w:t>22</w:t>
-      </w:r>
-      <w:r>
-        <w:t>0V suporta 15.400 VA. A demanda diária raramente atinge a carga total instalada (ninguém liga todos os chuveiros e ares-condicionados no mesmo segundo). Por isso o disjuntor de 70A e o cabo de 10 mm2 funcionam perfeitamente na prática, pois a corrente de uso costuma flutuar entre 30A e 50A. Além disso, o disjuntor do medidor (70A) é maior que o interno (63A) por Seletividade, garantindo que o</w:t>
-      </w:r>
-      <w:r>
-        <w:t xml:space="preserve"> </w:t>
-      </w:r>
-      <w:r>
-        <w:t>desarme aconteça dentro de casa em caso de pico extremo.</w:t>
-      </w:r>
+        <w:jc w:val="both"/>
+      </w:pPr>
+      <w:r>
+        <w:rPr>
+          <w:rFonts w:eastAsia="Times New Roman"/>
+          <w:b/>
+          <w:bCs/>
+        </w:rPr>
+        <w:lastRenderedPageBreak/>
+        <w:t xml:space="preserve">IDR em instalações sem Fio Terra: </w:t>
+      </w:r>
+      <w:r>
+        <w:t>Um alerta didático que quebra o mito de que o IDR precisa de aterramento para funcionar, mostrando como ele protege vidas mesmo em casas antigas.</w:t>
+      </w:r>
+    </w:p>
+    <w:p>
+      <w:pPr>
+        <w:pStyle w:val="PargrafodaLista"/>
+        <w:ind w:left="1068"/>
+        <w:jc w:val="center"/>
+      </w:pPr>
+      <w:r>
+        <w:drawing>
+          <wp:inline distT="0" distB="0" distL="0" distR="0" wp14:anchorId="798B512E" wp14:editId="197AD056">
+            <wp:extent cx="1328920" cy="2238375"/>
+            <wp:effectExtent l="0" t="0" r="5080" b="0"/>
+            <wp:docPr id="5" name="Imagem 5"/>
+            <wp:cNvGraphicFramePr>
+              <a:graphicFrameLocks xmlns:a="http://schemas.openxmlformats.org/drawingml/2006/main" noChangeAspect="1"/>
+            </wp:cNvGraphicFramePr>
+            <a:graphic xmlns:a="http://schemas.openxmlformats.org/drawingml/2006/main">
+              <a:graphicData uri="http://schemas.openxmlformats.org/drawingml/2006/picture">
+                <pic:pic xmlns:pic="http://schemas.openxmlformats.org/drawingml/2006/picture">
+                  <pic:nvPicPr>
+                    <pic:cNvPr id="1" name=""/>
+                    <pic:cNvPicPr/>
+                  </pic:nvPicPr>
+                  <pic:blipFill>
+                    <a:blip r:embed="rId25"/>
+                    <a:stretch>
+                      <a:fillRect/>
+                    </a:stretch>
+                  </pic:blipFill>
+                  <pic:spPr>
+                    <a:xfrm>
+                      <a:off x="0" y="0"/>
+                      <a:ext cx="1360310" cy="2291247"/>
+                    </a:xfrm>
+                    <a:prstGeom prst="rect">
+                      <a:avLst/>
+                    </a:prstGeom>
+                  </pic:spPr>
+                </pic:pic>
+              </a:graphicData>
+            </a:graphic>
+          </wp:inline>
+        </w:drawing>
+      </w:r>
+    </w:p>
+    <w:p>
+      <w:pPr>
+        <w:pStyle w:val="PargrafodaLista"/>
+        <w:numPr>
+          <w:ilvl w:val="0"/>
+          <w:numId w:val="11"/>
+        </w:numPr>
+        <w:jc w:val="both"/>
+      </w:pPr>
+      <w:r>
+        <w:rPr>
+          <w:rFonts w:eastAsia="Times New Roman"/>
+          <w:b/>
+          <w:bCs/>
+        </w:rPr>
+        <w:t xml:space="preserve">DPS sem Aterramento (Alerta Crítico): </w:t>
+      </w:r>
+      <w:r>
+        <w:t>Documentação técnica mostrando o risco de instalar um DPS sem conectar ao barramento de terra, o que inutiliza o componente e gera risco de incêndio.</w:t>
+      </w:r>
+    </w:p>
+    <w:p>
+      <w:pPr>
+        <w:pStyle w:val="PargrafodaLista"/>
+        <w:ind w:left="1068"/>
+        <w:jc w:val="center"/>
+      </w:pPr>
+      <w:r>
+        <w:drawing>
+          <wp:inline distT="0" distB="0" distL="0" distR="0" wp14:anchorId="4128AA8F" wp14:editId="10988791">
+            <wp:extent cx="1333594" cy="2257425"/>
+            <wp:effectExtent l="0" t="0" r="0" b="0"/>
+            <wp:docPr id="6" name="Imagem 6"/>
+            <wp:cNvGraphicFramePr>
+              <a:graphicFrameLocks xmlns:a="http://schemas.openxmlformats.org/drawingml/2006/main" noChangeAspect="1"/>
+            </wp:cNvGraphicFramePr>
+            <a:graphic xmlns:a="http://schemas.openxmlformats.org/drawingml/2006/main">
+              <a:graphicData uri="http://schemas.openxmlformats.org/drawingml/2006/picture">
+                <pic:pic xmlns:pic="http://schemas.openxmlformats.org/drawingml/2006/picture">
+                  <pic:nvPicPr>
+                    <pic:cNvPr id="1" name=""/>
+                    <pic:cNvPicPr/>
+                  </pic:nvPicPr>
+                  <pic:blipFill>
+                    <a:blip r:embed="rId26"/>
+                    <a:stretch>
+                      <a:fillRect/>
+                    </a:stretch>
+                  </pic:blipFill>
+                  <pic:spPr>
+                    <a:xfrm>
+                      <a:off x="0" y="0"/>
+                      <a:ext cx="1344536" cy="2275947"/>
+                    </a:xfrm>
+                    <a:prstGeom prst="rect">
+                      <a:avLst/>
+                    </a:prstGeom>
+                  </pic:spPr>
+                </pic:pic>
+              </a:graphicData>
+            </a:graphic>
+          </wp:inline>
+        </w:drawing>
+      </w:r>
+    </w:p>
+    <w:p>
+      <w:pPr>
+        <w:pStyle w:val="PargrafodaLista"/>
+        <w:numPr>
+          <w:ilvl w:val="0"/>
+          <w:numId w:val="11"/>
+        </w:numPr>
+        <w:jc w:val="both"/>
+      </w:pPr>
+      <w:proofErr w:type="spellStart"/>
+      <w:r>
+        <w:rPr>
+          <w:rFonts w:eastAsia="Times New Roman"/>
+          <w:b/>
+          <w:bCs/>
+        </w:rPr>
+        <w:t>Retrofit</w:t>
+      </w:r>
+      <w:proofErr w:type="spellEnd"/>
+      <w:r>
+        <w:rPr>
+          <w:rFonts w:eastAsia="Times New Roman"/>
+          <w:b/>
+          <w:bCs/>
+        </w:rPr>
+        <w:t xml:space="preserve"> (Modernizando Quadro de Madeira): </w:t>
+      </w:r>
+      <w:r>
+        <w:t>Um passo a passo prático de como substituir quadros antigos de embutir usando caixas de sobrepor e espuma expansiva (PU corta-fogo), sem precisar quebrar a parede do cliente.</w:t>
+      </w:r>
+    </w:p>
+    <w:p>
+      <w:pPr>
+        <w:pStyle w:val="PargrafodaLista"/>
+        <w:ind w:left="1068"/>
+        <w:jc w:val="center"/>
+      </w:pPr>
+      <w:r>
+        <w:drawing>
+          <wp:inline distT="0" distB="0" distL="0" distR="0" wp14:anchorId="4BA81A7D" wp14:editId="0F04069B">
+            <wp:extent cx="1400175" cy="2356962"/>
+            <wp:effectExtent l="0" t="0" r="0" b="5715"/>
+            <wp:docPr id="7" name="Imagem 7"/>
+            <wp:cNvGraphicFramePr>
+              <a:graphicFrameLocks xmlns:a="http://schemas.openxmlformats.org/drawingml/2006/main" noChangeAspect="1"/>
+            </wp:cNvGraphicFramePr>
+            <a:graphic xmlns:a="http://schemas.openxmlformats.org/drawingml/2006/main">
+              <a:graphicData uri="http://schemas.openxmlformats.org/drawingml/2006/picture">
+                <pic:pic xmlns:pic="http://schemas.openxmlformats.org/drawingml/2006/picture">
+                  <pic:nvPicPr>
+                    <pic:cNvPr id="1" name=""/>
+                    <pic:cNvPicPr/>
+                  </pic:nvPicPr>
+                  <pic:blipFill>
+                    <a:blip r:embed="rId27"/>
+                    <a:stretch>
+                      <a:fillRect/>
+                    </a:stretch>
+                  </pic:blipFill>
+                  <pic:spPr>
+                    <a:xfrm>
+                      <a:off x="0" y="0"/>
+                      <a:ext cx="1415504" cy="2382766"/>
+                    </a:xfrm>
+                    <a:prstGeom prst="rect">
+                      <a:avLst/>
+                    </a:prstGeom>
+                  </pic:spPr>
+                </pic:pic>
+              </a:graphicData>
+            </a:graphic>
+          </wp:inline>
+        </w:drawing>
+      </w:r>
+    </w:p>
+    <w:p>
+      <w:pPr>
+        <w:pStyle w:val="PargrafodaLista"/>
+        <w:numPr>
+          <w:ilvl w:val="0"/>
+          <w:numId w:val="11"/>
+        </w:numPr>
+        <w:jc w:val="both"/>
+      </w:pPr>
+      <w:r>
+        <w:rPr>
+          <w:rFonts w:eastAsia="Times New Roman"/>
+          <w:b/>
+          <w:bCs/>
+        </w:rPr>
+        <w:lastRenderedPageBreak/>
+        <w:t xml:space="preserve">Galeria de Quadros (Padrões de Montagem): </w:t>
+      </w:r>
+      <w:r>
+        <w:t>Um banco de imagens integrado ao aplicativo com exemplos de Quadros de Distribuição bem montados, detalhando o uso</w:t>
+      </w:r>
+      <w:r>
+        <w:t xml:space="preserve"> de barramentos tipo pente, terminais ilhós e separação de circuitos para você usar de inspiração.</w:t>
+      </w:r>
+    </w:p>
+    <w:p>
+      <w:pPr>
+        <w:pStyle w:val="PargrafodaLista"/>
+        <w:ind w:left="1068"/>
+        <w:jc w:val="center"/>
+      </w:pPr>
+      <w:r>
+        <w:drawing>
+          <wp:inline distT="0" distB="0" distL="0" distR="0" wp14:anchorId="7863969D" wp14:editId="5A8D18BC">
+            <wp:extent cx="1410557" cy="2390775"/>
+            <wp:effectExtent l="0" t="0" r="0" b="0"/>
+            <wp:docPr id="8" name="Imagem 8"/>
+            <wp:cNvGraphicFramePr>
+              <a:graphicFrameLocks xmlns:a="http://schemas.openxmlformats.org/drawingml/2006/main" noChangeAspect="1"/>
+            </wp:cNvGraphicFramePr>
+            <a:graphic xmlns:a="http://schemas.openxmlformats.org/drawingml/2006/main">
+              <a:graphicData uri="http://schemas.openxmlformats.org/drawingml/2006/picture">
+                <pic:pic xmlns:pic="http://schemas.openxmlformats.org/drawingml/2006/picture">
+                  <pic:nvPicPr>
+                    <pic:cNvPr id="1" name=""/>
+                    <pic:cNvPicPr/>
+                  </pic:nvPicPr>
+                  <pic:blipFill>
+                    <a:blip r:embed="rId28"/>
+                    <a:stretch>
+                      <a:fillRect/>
+                    </a:stretch>
+                  </pic:blipFill>
+                  <pic:spPr>
+                    <a:xfrm>
+                      <a:off x="0" y="0"/>
+                      <a:ext cx="1421076" cy="2408603"/>
+                    </a:xfrm>
+                    <a:prstGeom prst="rect">
+                      <a:avLst/>
+                    </a:prstGeom>
+                  </pic:spPr>
+                </pic:pic>
+              </a:graphicData>
+            </a:graphic>
+          </wp:inline>
+        </w:drawing>
+      </w:r>
+      <w:bookmarkStart w:id="0" w:name="_GoBack"/>
+      <w:bookmarkEnd w:id="0"/>
     </w:p>
     <w:sectPr>
       <w:pgSz w:w="11906" w:h="16838" w:code="9"/>
@@ -2365,7 +2974,7 @@
       <w:lvlText w:val="%1."/>
       <w:lvlJc w:val="left"/>
       <w:pPr>
-        <w:ind w:left="360" w:hanging="360"/>
+        <w:ind w:left="720" w:hanging="360"/>
       </w:pPr>
       <w:rPr>
         <w:rFonts w:hint="default"/>
@@ -2377,7 +2986,7 @@
       <w:lvlText w:val="o"/>
       <w:lvlJc w:val="left"/>
       <w:pPr>
-        <w:ind w:left="1080" w:hanging="360"/>
+        <w:ind w:left="1440" w:hanging="360"/>
       </w:pPr>
       <w:rPr>
         <w:rFonts w:ascii="Courier New" w:hAnsi="Courier New" w:cs="Courier New" w:hint="default"/>
@@ -2389,7 +2998,7 @@
       <w:lvlText w:val=""/>
       <w:lvlJc w:val="left"/>
       <w:pPr>
-        <w:ind w:left="1800" w:hanging="360"/>
+        <w:ind w:left="2160" w:hanging="360"/>
       </w:pPr>
       <w:rPr>
         <w:rFonts w:ascii="Wingdings" w:hAnsi="Wingdings" w:hint="default"/>
@@ -2401,7 +3010,7 @@
       <w:lvlText w:val=""/>
       <w:lvlJc w:val="left"/>
       <w:pPr>
-        <w:ind w:left="2520" w:hanging="360"/>
+        <w:ind w:left="2880" w:hanging="360"/>
       </w:pPr>
       <w:rPr>
         <w:rFonts w:ascii="Symbol" w:hAnsi="Symbol" w:hint="default"/>
@@ -2413,7 +3022,7 @@
       <w:lvlText w:val="o"/>
       <w:lvlJc w:val="left"/>
       <w:pPr>
-        <w:ind w:left="3240" w:hanging="360"/>
+        <w:ind w:left="3600" w:hanging="360"/>
       </w:pPr>
       <w:rPr>
         <w:rFonts w:ascii="Courier New" w:hAnsi="Courier New" w:cs="Courier New" w:hint="default"/>
@@ -2425,7 +3034,7 @@
       <w:lvlText w:val=""/>
       <w:lvlJc w:val="left"/>
       <w:pPr>
-        <w:ind w:left="3960" w:hanging="360"/>
+        <w:ind w:left="4320" w:hanging="360"/>
       </w:pPr>
       <w:rPr>
         <w:rFonts w:ascii="Wingdings" w:hAnsi="Wingdings" w:hint="default"/>
@@ -2437,7 +3046,7 @@
       <w:lvlText w:val=""/>
       <w:lvlJc w:val="left"/>
       <w:pPr>
-        <w:ind w:left="4680" w:hanging="360"/>
+        <w:ind w:left="5040" w:hanging="360"/>
       </w:pPr>
       <w:rPr>
         <w:rFonts w:ascii="Symbol" w:hAnsi="Symbol" w:hint="default"/>
@@ -2449,7 +3058,7 @@
       <w:lvlText w:val="o"/>
       <w:lvlJc w:val="left"/>
       <w:pPr>
-        <w:ind w:left="5400" w:hanging="360"/>
+        <w:ind w:left="5760" w:hanging="360"/>
       </w:pPr>
       <w:rPr>
         <w:rFonts w:ascii="Courier New" w:hAnsi="Courier New" w:cs="Courier New" w:hint="default"/>
@@ -2461,7 +3070,7 @@
       <w:lvlText w:val=""/>
       <w:lvlJc w:val="left"/>
       <w:pPr>
-        <w:ind w:left="6120" w:hanging="360"/>
+        <w:ind w:left="6480" w:hanging="360"/>
       </w:pPr>
       <w:rPr>
         <w:rFonts w:ascii="Wingdings" w:hAnsi="Wingdings" w:hint="default"/>
@@ -2469,6 +3078,268 @@
     </w:lvl>
   </w:abstractNum>
   <w:abstractNum w:abstractNumId="1" w15:restartNumberingAfterBreak="0">
+    <w:nsid w:val="05A94DDE"/>
+    <w:multiLevelType w:val="hybridMultilevel"/>
+    <w:tmpl w:val="69185904"/>
+    <w:lvl w:ilvl="0" w:tplc="0409000F">
+      <w:start w:val="1"/>
+      <w:numFmt w:val="decimal"/>
+      <w:lvlText w:val="%1."/>
+      <w:lvlJc w:val="left"/>
+      <w:pPr>
+        <w:ind w:left="720" w:hanging="360"/>
+      </w:pPr>
+      <w:rPr>
+        <w:rFonts w:hint="default"/>
+      </w:rPr>
+    </w:lvl>
+    <w:lvl w:ilvl="1" w:tplc="04090003">
+      <w:start w:val="1"/>
+      <w:numFmt w:val="bullet"/>
+      <w:lvlText w:val="o"/>
+      <w:lvlJc w:val="left"/>
+      <w:pPr>
+        <w:ind w:left="1440" w:hanging="360"/>
+      </w:pPr>
+      <w:rPr>
+        <w:rFonts w:ascii="Courier New" w:hAnsi="Courier New" w:cs="Courier New" w:hint="default"/>
+      </w:rPr>
+    </w:lvl>
+    <w:lvl w:ilvl="2" w:tplc="04090005" w:tentative="1">
+      <w:start w:val="1"/>
+      <w:numFmt w:val="bullet"/>
+      <w:lvlText w:val=""/>
+      <w:lvlJc w:val="left"/>
+      <w:pPr>
+        <w:ind w:left="2160" w:hanging="360"/>
+      </w:pPr>
+      <w:rPr>
+        <w:rFonts w:ascii="Wingdings" w:hAnsi="Wingdings" w:hint="default"/>
+      </w:rPr>
+    </w:lvl>
+    <w:lvl w:ilvl="3" w:tplc="04090001" w:tentative="1">
+      <w:start w:val="1"/>
+      <w:numFmt w:val="bullet"/>
+      <w:lvlText w:val=""/>
+      <w:lvlJc w:val="left"/>
+      <w:pPr>
+        <w:ind w:left="2880" w:hanging="360"/>
+      </w:pPr>
+      <w:rPr>
+        <w:rFonts w:ascii="Symbol" w:hAnsi="Symbol" w:hint="default"/>
+      </w:rPr>
+    </w:lvl>
+    <w:lvl w:ilvl="4" w:tplc="04090003" w:tentative="1">
+      <w:start w:val="1"/>
+      <w:numFmt w:val="bullet"/>
+      <w:lvlText w:val="o"/>
+      <w:lvlJc w:val="left"/>
+      <w:pPr>
+        <w:ind w:left="3600" w:hanging="360"/>
+      </w:pPr>
+      <w:rPr>
+        <w:rFonts w:ascii="Courier New" w:hAnsi="Courier New" w:cs="Courier New" w:hint="default"/>
+      </w:rPr>
+    </w:lvl>
+    <w:lvl w:ilvl="5" w:tplc="04090005" w:tentative="1">
+      <w:start w:val="1"/>
+      <w:numFmt w:val="bullet"/>
+      <w:lvlText w:val=""/>
+      <w:lvlJc w:val="left"/>
+      <w:pPr>
+        <w:ind w:left="4320" w:hanging="360"/>
+      </w:pPr>
+      <w:rPr>
+        <w:rFonts w:ascii="Wingdings" w:hAnsi="Wingdings" w:hint="default"/>
+      </w:rPr>
+    </w:lvl>
+    <w:lvl w:ilvl="6" w:tplc="04090001" w:tentative="1">
+      <w:start w:val="1"/>
+      <w:numFmt w:val="bullet"/>
+      <w:lvlText w:val=""/>
+      <w:lvlJc w:val="left"/>
+      <w:pPr>
+        <w:ind w:left="5040" w:hanging="360"/>
+      </w:pPr>
+      <w:rPr>
+        <w:rFonts w:ascii="Symbol" w:hAnsi="Symbol" w:hint="default"/>
+      </w:rPr>
+    </w:lvl>
+    <w:lvl w:ilvl="7" w:tplc="04090003" w:tentative="1">
+      <w:start w:val="1"/>
+      <w:numFmt w:val="bullet"/>
+      <w:lvlText w:val="o"/>
+      <w:lvlJc w:val="left"/>
+      <w:pPr>
+        <w:ind w:left="5760" w:hanging="360"/>
+      </w:pPr>
+      <w:rPr>
+        <w:rFonts w:ascii="Courier New" w:hAnsi="Courier New" w:cs="Courier New" w:hint="default"/>
+      </w:rPr>
+    </w:lvl>
+    <w:lvl w:ilvl="8" w:tplc="04090005" w:tentative="1">
+      <w:start w:val="1"/>
+      <w:numFmt w:val="bullet"/>
+      <w:lvlText w:val=""/>
+      <w:lvlJc w:val="left"/>
+      <w:pPr>
+        <w:ind w:left="6480" w:hanging="360"/>
+      </w:pPr>
+      <w:rPr>
+        <w:rFonts w:ascii="Wingdings" w:hAnsi="Wingdings" w:hint="default"/>
+      </w:rPr>
+    </w:lvl>
+  </w:abstractNum>
+  <w:abstractNum w:abstractNumId="2" w15:restartNumberingAfterBreak="0">
+    <w:nsid w:val="0CBF2822"/>
+    <w:multiLevelType w:val="multilevel"/>
+    <w:tmpl w:val="D35E380C"/>
+    <w:lvl w:ilvl="0">
+      <w:start w:val="1"/>
+      <w:numFmt w:val="bullet"/>
+      <w:lvlText w:val=""/>
+      <w:lvlJc w:val="left"/>
+      <w:pPr>
+        <w:tabs>
+          <w:tab w:val="num" w:pos="720"/>
+        </w:tabs>
+        <w:ind w:left="720" w:hanging="360"/>
+      </w:pPr>
+      <w:rPr>
+        <w:rFonts w:ascii="Symbol" w:hAnsi="Symbol" w:hint="default"/>
+        <w:sz w:val="20"/>
+      </w:rPr>
+    </w:lvl>
+    <w:lvl w:ilvl="1" w:tentative="1">
+      <w:start w:val="1"/>
+      <w:numFmt w:val="bullet"/>
+      <w:lvlText w:val="o"/>
+      <w:lvlJc w:val="left"/>
+      <w:pPr>
+        <w:tabs>
+          <w:tab w:val="num" w:pos="1440"/>
+        </w:tabs>
+        <w:ind w:left="1440" w:hanging="360"/>
+      </w:pPr>
+      <w:rPr>
+        <w:rFonts w:ascii="Courier New" w:hAnsi="Courier New" w:hint="default"/>
+        <w:sz w:val="20"/>
+      </w:rPr>
+    </w:lvl>
+    <w:lvl w:ilvl="2" w:tentative="1">
+      <w:start w:val="1"/>
+      <w:numFmt w:val="bullet"/>
+      <w:lvlText w:val=""/>
+      <w:lvlJc w:val="left"/>
+      <w:pPr>
+        <w:tabs>
+          <w:tab w:val="num" w:pos="2160"/>
+        </w:tabs>
+        <w:ind w:left="2160" w:hanging="360"/>
+      </w:pPr>
+      <w:rPr>
+        <w:rFonts w:ascii="Wingdings" w:hAnsi="Wingdings" w:hint="default"/>
+        <w:sz w:val="20"/>
+      </w:rPr>
+    </w:lvl>
+    <w:lvl w:ilvl="3" w:tentative="1">
+      <w:start w:val="1"/>
+      <w:numFmt w:val="bullet"/>
+      <w:lvlText w:val=""/>
+      <w:lvlJc w:val="left"/>
+      <w:pPr>
+        <w:tabs>
+          <w:tab w:val="num" w:pos="2880"/>
+        </w:tabs>
+        <w:ind w:left="2880" w:hanging="360"/>
+      </w:pPr>
+      <w:rPr>
+        <w:rFonts w:ascii="Wingdings" w:hAnsi="Wingdings" w:hint="default"/>
+        <w:sz w:val="20"/>
+      </w:rPr>
+    </w:lvl>
+    <w:lvl w:ilvl="4" w:tentative="1">
+      <w:start w:val="1"/>
+      <w:numFmt w:val="bullet"/>
+      <w:lvlText w:val=""/>
+      <w:lvlJc w:val="left"/>
+      <w:pPr>
+        <w:tabs>
+          <w:tab w:val="num" w:pos="3600"/>
+        </w:tabs>
+        <w:ind w:left="3600" w:hanging="360"/>
+      </w:pPr>
+      <w:rPr>
+        <w:rFonts w:ascii="Wingdings" w:hAnsi="Wingdings" w:hint="default"/>
+        <w:sz w:val="20"/>
+      </w:rPr>
+    </w:lvl>
+    <w:lvl w:ilvl="5" w:tentative="1">
+      <w:start w:val="1"/>
+      <w:numFmt w:val="bullet"/>
+      <w:lvlText w:val=""/>
+      <w:lvlJc w:val="left"/>
+      <w:pPr>
+        <w:tabs>
+          <w:tab w:val="num" w:pos="4320"/>
+        </w:tabs>
+        <w:ind w:left="4320" w:hanging="360"/>
+      </w:pPr>
+      <w:rPr>
+        <w:rFonts w:ascii="Wingdings" w:hAnsi="Wingdings" w:hint="default"/>
+        <w:sz w:val="20"/>
+      </w:rPr>
+    </w:lvl>
+    <w:lvl w:ilvl="6" w:tentative="1">
+      <w:start w:val="1"/>
+      <w:numFmt w:val="bullet"/>
+      <w:lvlText w:val=""/>
+      <w:lvlJc w:val="left"/>
+      <w:pPr>
+        <w:tabs>
+          <w:tab w:val="num" w:pos="5040"/>
+        </w:tabs>
+        <w:ind w:left="5040" w:hanging="360"/>
+      </w:pPr>
+      <w:rPr>
+        <w:rFonts w:ascii="Wingdings" w:hAnsi="Wingdings" w:hint="default"/>
+        <w:sz w:val="20"/>
+      </w:rPr>
+    </w:lvl>
+    <w:lvl w:ilvl="7" w:tentative="1">
+      <w:start w:val="1"/>
+      <w:numFmt w:val="bullet"/>
+      <w:lvlText w:val=""/>
+      <w:lvlJc w:val="left"/>
+      <w:pPr>
+        <w:tabs>
+          <w:tab w:val="num" w:pos="5760"/>
+        </w:tabs>
+        <w:ind w:left="5760" w:hanging="360"/>
+      </w:pPr>
+      <w:rPr>
+        <w:rFonts w:ascii="Wingdings" w:hAnsi="Wingdings" w:hint="default"/>
+        <w:sz w:val="20"/>
+      </w:rPr>
+    </w:lvl>
+    <w:lvl w:ilvl="8" w:tentative="1">
+      <w:start w:val="1"/>
+      <w:numFmt w:val="bullet"/>
+      <w:lvlText w:val=""/>
+      <w:lvlJc w:val="left"/>
+      <w:pPr>
+        <w:tabs>
+          <w:tab w:val="num" w:pos="6480"/>
+        </w:tabs>
+        <w:ind w:left="6480" w:hanging="360"/>
+      </w:pPr>
+      <w:rPr>
+        <w:rFonts w:ascii="Wingdings" w:hAnsi="Wingdings" w:hint="default"/>
+        <w:sz w:val="20"/>
+      </w:rPr>
+    </w:lvl>
+  </w:abstractNum>
+  <w:abstractNum w:abstractNumId="3" w15:restartNumberingAfterBreak="0">
     <w:nsid w:val="12783F28"/>
     <w:multiLevelType w:val="multilevel"/>
     <w:tmpl w:val="41AE1E7A"/>
@@ -2584,7 +3455,7 @@
       </w:pPr>
     </w:lvl>
   </w:abstractNum>
-  <w:abstractNum w:abstractNumId="2" w15:restartNumberingAfterBreak="0">
+  <w:abstractNum w:abstractNumId="4" w15:restartNumberingAfterBreak="0">
     <w:nsid w:val="1A0851F9"/>
     <w:multiLevelType w:val="multilevel"/>
     <w:tmpl w:val="1F28C206"/>
@@ -2733,7 +3604,7 @@
       </w:rPr>
     </w:lvl>
   </w:abstractNum>
-  <w:abstractNum w:abstractNumId="3" w15:restartNumberingAfterBreak="0">
+  <w:abstractNum w:abstractNumId="5" w15:restartNumberingAfterBreak="0">
     <w:nsid w:val="1D255B2A"/>
     <w:multiLevelType w:val="multilevel"/>
     <w:tmpl w:val="2988B1D0"/>
@@ -2850,7 +3721,7 @@
       </w:pPr>
     </w:lvl>
   </w:abstractNum>
-  <w:abstractNum w:abstractNumId="4" w15:restartNumberingAfterBreak="0">
+  <w:abstractNum w:abstractNumId="6" w15:restartNumberingAfterBreak="0">
     <w:nsid w:val="20E10307"/>
     <w:multiLevelType w:val="hybridMultilevel"/>
     <w:tmpl w:val="7310A5C0"/>
@@ -2963,7 +3834,7 @@
       </w:rPr>
     </w:lvl>
   </w:abstractNum>
-  <w:abstractNum w:abstractNumId="5" w15:restartNumberingAfterBreak="0">
+  <w:abstractNum w:abstractNumId="7" w15:restartNumberingAfterBreak="0">
     <w:nsid w:val="27B33088"/>
     <w:multiLevelType w:val="multilevel"/>
     <w:tmpl w:val="3A44992C"/>
@@ -3112,7 +3983,7 @@
       </w:rPr>
     </w:lvl>
   </w:abstractNum>
-  <w:abstractNum w:abstractNumId="6" w15:restartNumberingAfterBreak="0">
+  <w:abstractNum w:abstractNumId="8" w15:restartNumberingAfterBreak="0">
     <w:nsid w:val="2A262AF8"/>
     <w:multiLevelType w:val="hybridMultilevel"/>
     <w:tmpl w:val="8E6C3A82"/>
@@ -3225,7 +4096,7 @@
       </w:rPr>
     </w:lvl>
   </w:abstractNum>
-  <w:abstractNum w:abstractNumId="7" w15:restartNumberingAfterBreak="0">
+  <w:abstractNum w:abstractNumId="9" w15:restartNumberingAfterBreak="0">
     <w:nsid w:val="3B223BFE"/>
     <w:multiLevelType w:val="multilevel"/>
     <w:tmpl w:val="718A3DC6"/>
@@ -3374,7 +4245,7 @@
       </w:rPr>
     </w:lvl>
   </w:abstractNum>
-  <w:abstractNum w:abstractNumId="8" w15:restartNumberingAfterBreak="0">
+  <w:abstractNum w:abstractNumId="10" w15:restartNumberingAfterBreak="0">
     <w:nsid w:val="453541F4"/>
     <w:multiLevelType w:val="hybridMultilevel"/>
     <w:tmpl w:val="FAFE7DF2"/>
@@ -3487,7 +4358,156 @@
       </w:rPr>
     </w:lvl>
   </w:abstractNum>
-  <w:abstractNum w:abstractNumId="9" w15:restartNumberingAfterBreak="0">
+  <w:abstractNum w:abstractNumId="11" w15:restartNumberingAfterBreak="0">
+    <w:nsid w:val="48F35884"/>
+    <w:multiLevelType w:val="multilevel"/>
+    <w:tmpl w:val="034275CC"/>
+    <w:lvl w:ilvl="0">
+      <w:start w:val="1"/>
+      <w:numFmt w:val="bullet"/>
+      <w:lvlText w:val=""/>
+      <w:lvlJc w:val="left"/>
+      <w:pPr>
+        <w:tabs>
+          <w:tab w:val="num" w:pos="720"/>
+        </w:tabs>
+        <w:ind w:left="720" w:hanging="360"/>
+      </w:pPr>
+      <w:rPr>
+        <w:rFonts w:ascii="Symbol" w:hAnsi="Symbol" w:hint="default"/>
+        <w:sz w:val="20"/>
+      </w:rPr>
+    </w:lvl>
+    <w:lvl w:ilvl="1" w:tentative="1">
+      <w:start w:val="1"/>
+      <w:numFmt w:val="bullet"/>
+      <w:lvlText w:val="o"/>
+      <w:lvlJc w:val="left"/>
+      <w:pPr>
+        <w:tabs>
+          <w:tab w:val="num" w:pos="1440"/>
+        </w:tabs>
+        <w:ind w:left="1440" w:hanging="360"/>
+      </w:pPr>
+      <w:rPr>
+        <w:rFonts w:ascii="Courier New" w:hAnsi="Courier New" w:hint="default"/>
+        <w:sz w:val="20"/>
+      </w:rPr>
+    </w:lvl>
+    <w:lvl w:ilvl="2" w:tentative="1">
+      <w:start w:val="1"/>
+      <w:numFmt w:val="bullet"/>
+      <w:lvlText w:val=""/>
+      <w:lvlJc w:val="left"/>
+      <w:pPr>
+        <w:tabs>
+          <w:tab w:val="num" w:pos="2160"/>
+        </w:tabs>
+        <w:ind w:left="2160" w:hanging="360"/>
+      </w:pPr>
+      <w:rPr>
+        <w:rFonts w:ascii="Wingdings" w:hAnsi="Wingdings" w:hint="default"/>
+        <w:sz w:val="20"/>
+      </w:rPr>
+    </w:lvl>
+    <w:lvl w:ilvl="3" w:tentative="1">
+      <w:start w:val="1"/>
+      <w:numFmt w:val="bullet"/>
+      <w:lvlText w:val=""/>
+      <w:lvlJc w:val="left"/>
+      <w:pPr>
+        <w:tabs>
+          <w:tab w:val="num" w:pos="2880"/>
+        </w:tabs>
+        <w:ind w:left="2880" w:hanging="360"/>
+      </w:pPr>
+      <w:rPr>
+        <w:rFonts w:ascii="Wingdings" w:hAnsi="Wingdings" w:hint="default"/>
+        <w:sz w:val="20"/>
+      </w:rPr>
+    </w:lvl>
+    <w:lvl w:ilvl="4" w:tentative="1">
+      <w:start w:val="1"/>
+      <w:numFmt w:val="bullet"/>
+      <w:lvlText w:val=""/>
+      <w:lvlJc w:val="left"/>
+      <w:pPr>
+        <w:tabs>
+          <w:tab w:val="num" w:pos="3600"/>
+        </w:tabs>
+        <w:ind w:left="3600" w:hanging="360"/>
+      </w:pPr>
+      <w:rPr>
+        <w:rFonts w:ascii="Wingdings" w:hAnsi="Wingdings" w:hint="default"/>
+        <w:sz w:val="20"/>
+      </w:rPr>
+    </w:lvl>
+    <w:lvl w:ilvl="5" w:tentative="1">
+      <w:start w:val="1"/>
+      <w:numFmt w:val="bullet"/>
+      <w:lvlText w:val=""/>
+      <w:lvlJc w:val="left"/>
+      <w:pPr>
+        <w:tabs>
+          <w:tab w:val="num" w:pos="4320"/>
+        </w:tabs>
+        <w:ind w:left="4320" w:hanging="360"/>
+      </w:pPr>
+      <w:rPr>
+        <w:rFonts w:ascii="Wingdings" w:hAnsi="Wingdings" w:hint="default"/>
+        <w:sz w:val="20"/>
+      </w:rPr>
+    </w:lvl>
+    <w:lvl w:ilvl="6" w:tentative="1">
+      <w:start w:val="1"/>
+      <w:numFmt w:val="bullet"/>
+      <w:lvlText w:val=""/>
+      <w:lvlJc w:val="left"/>
+      <w:pPr>
+        <w:tabs>
+          <w:tab w:val="num" w:pos="5040"/>
+        </w:tabs>
+        <w:ind w:left="5040" w:hanging="360"/>
+      </w:pPr>
+      <w:rPr>
+        <w:rFonts w:ascii="Wingdings" w:hAnsi="Wingdings" w:hint="default"/>
+        <w:sz w:val="20"/>
+      </w:rPr>
+    </w:lvl>
+    <w:lvl w:ilvl="7" w:tentative="1">
+      <w:start w:val="1"/>
+      <w:numFmt w:val="bullet"/>
+      <w:lvlText w:val=""/>
+      <w:lvlJc w:val="left"/>
+      <w:pPr>
+        <w:tabs>
+          <w:tab w:val="num" w:pos="5760"/>
+        </w:tabs>
+        <w:ind w:left="5760" w:hanging="360"/>
+      </w:pPr>
+      <w:rPr>
+        <w:rFonts w:ascii="Wingdings" w:hAnsi="Wingdings" w:hint="default"/>
+        <w:sz w:val="20"/>
+      </w:rPr>
+    </w:lvl>
+    <w:lvl w:ilvl="8" w:tentative="1">
+      <w:start w:val="1"/>
+      <w:numFmt w:val="bullet"/>
+      <w:lvlText w:val=""/>
+      <w:lvlJc w:val="left"/>
+      <w:pPr>
+        <w:tabs>
+          <w:tab w:val="num" w:pos="6480"/>
+        </w:tabs>
+        <w:ind w:left="6480" w:hanging="360"/>
+      </w:pPr>
+      <w:rPr>
+        <w:rFonts w:ascii="Wingdings" w:hAnsi="Wingdings" w:hint="default"/>
+        <w:sz w:val="20"/>
+      </w:rPr>
+    </w:lvl>
+  </w:abstractNum>
+  <w:abstractNum w:abstractNumId="12" w15:restartNumberingAfterBreak="0">
     <w:nsid w:val="58CF3B57"/>
     <w:multiLevelType w:val="hybridMultilevel"/>
     <w:tmpl w:val="2CCAADB8"/>
@@ -3600,7 +4620,7 @@
       </w:rPr>
     </w:lvl>
   </w:abstractNum>
-  <w:abstractNum w:abstractNumId="10" w15:restartNumberingAfterBreak="0">
+  <w:abstractNum w:abstractNumId="13" w15:restartNumberingAfterBreak="0">
     <w:nsid w:val="5CFB6106"/>
     <w:multiLevelType w:val="multilevel"/>
     <w:tmpl w:val="D69E02FA"/>
@@ -3749,7 +4769,120 @@
       </w:rPr>
     </w:lvl>
   </w:abstractNum>
-  <w:abstractNum w:abstractNumId="11" w15:restartNumberingAfterBreak="0">
+  <w:abstractNum w:abstractNumId="14" w15:restartNumberingAfterBreak="0">
+    <w:nsid w:val="6FF71B3F"/>
+    <w:multiLevelType w:val="hybridMultilevel"/>
+    <w:tmpl w:val="7310A5C0"/>
+    <w:lvl w:ilvl="0" w:tplc="0409000F">
+      <w:start w:val="1"/>
+      <w:numFmt w:val="decimal"/>
+      <w:lvlText w:val="%1."/>
+      <w:lvlJc w:val="left"/>
+      <w:pPr>
+        <w:ind w:left="360" w:hanging="360"/>
+      </w:pPr>
+      <w:rPr>
+        <w:rFonts w:hint="default"/>
+      </w:rPr>
+    </w:lvl>
+    <w:lvl w:ilvl="1" w:tplc="04090003">
+      <w:start w:val="1"/>
+      <w:numFmt w:val="bullet"/>
+      <w:lvlText w:val="o"/>
+      <w:lvlJc w:val="left"/>
+      <w:pPr>
+        <w:ind w:left="1080" w:hanging="360"/>
+      </w:pPr>
+      <w:rPr>
+        <w:rFonts w:ascii="Courier New" w:hAnsi="Courier New" w:cs="Courier New" w:hint="default"/>
+      </w:rPr>
+    </w:lvl>
+    <w:lvl w:ilvl="2" w:tplc="04090005" w:tentative="1">
+      <w:start w:val="1"/>
+      <w:numFmt w:val="bullet"/>
+      <w:lvlText w:val=""/>
+      <w:lvlJc w:val="left"/>
+      <w:pPr>
+        <w:ind w:left="1800" w:hanging="360"/>
+      </w:pPr>
+      <w:rPr>
+        <w:rFonts w:ascii="Wingdings" w:hAnsi="Wingdings" w:hint="default"/>
+      </w:rPr>
+    </w:lvl>
+    <w:lvl w:ilvl="3" w:tplc="04090001" w:tentative="1">
+      <w:start w:val="1"/>
+      <w:numFmt w:val="bullet"/>
+      <w:lvlText w:val=""/>
+      <w:lvlJc w:val="left"/>
+      <w:pPr>
+        <w:ind w:left="2520" w:hanging="360"/>
+      </w:pPr>
+      <w:rPr>
+        <w:rFonts w:ascii="Symbol" w:hAnsi="Symbol" w:hint="default"/>
+      </w:rPr>
+    </w:lvl>
+    <w:lvl w:ilvl="4" w:tplc="04090003" w:tentative="1">
+      <w:start w:val="1"/>
+      <w:numFmt w:val="bullet"/>
+      <w:lvlText w:val="o"/>
+      <w:lvlJc w:val="left"/>
+      <w:pPr>
+        <w:ind w:left="3240" w:hanging="360"/>
+      </w:pPr>
+      <w:rPr>
+        <w:rFonts w:ascii="Courier New" w:hAnsi="Courier New" w:cs="Courier New" w:hint="default"/>
+      </w:rPr>
+    </w:lvl>
+    <w:lvl w:ilvl="5" w:tplc="04090005" w:tentative="1">
+      <w:start w:val="1"/>
+      <w:numFmt w:val="bullet"/>
+      <w:lvlText w:val=""/>
+      <w:lvlJc w:val="left"/>
+      <w:pPr>
+        <w:ind w:left="3960" w:hanging="360"/>
+      </w:pPr>
+      <w:rPr>
+        <w:rFonts w:ascii="Wingdings" w:hAnsi="Wingdings" w:hint="default"/>
+      </w:rPr>
+    </w:lvl>
+    <w:lvl w:ilvl="6" w:tplc="04090001" w:tentative="1">
+      <w:start w:val="1"/>
+      <w:numFmt w:val="bullet"/>
+      <w:lvlText w:val=""/>
+      <w:lvlJc w:val="left"/>
+      <w:pPr>
+        <w:ind w:left="4680" w:hanging="360"/>
+      </w:pPr>
+      <w:rPr>
+        <w:rFonts w:ascii="Symbol" w:hAnsi="Symbol" w:hint="default"/>
+      </w:rPr>
+    </w:lvl>
+    <w:lvl w:ilvl="7" w:tplc="04090003" w:tentative="1">
+      <w:start w:val="1"/>
+      <w:numFmt w:val="bullet"/>
+      <w:lvlText w:val="o"/>
+      <w:lvlJc w:val="left"/>
+      <w:pPr>
+        <w:ind w:left="5400" w:hanging="360"/>
+      </w:pPr>
+      <w:rPr>
+        <w:rFonts w:ascii="Courier New" w:hAnsi="Courier New" w:cs="Courier New" w:hint="default"/>
+      </w:rPr>
+    </w:lvl>
+    <w:lvl w:ilvl="8" w:tplc="04090005" w:tentative="1">
+      <w:start w:val="1"/>
+      <w:numFmt w:val="bullet"/>
+      <w:lvlText w:val=""/>
+      <w:lvlJc w:val="left"/>
+      <w:pPr>
+        <w:ind w:left="6120" w:hanging="360"/>
+      </w:pPr>
+      <w:rPr>
+        <w:rFonts w:ascii="Wingdings" w:hAnsi="Wingdings" w:hint="default"/>
+      </w:rPr>
+    </w:lvl>
+  </w:abstractNum>
+  <w:abstractNum w:abstractNumId="15" w15:restartNumberingAfterBreak="0">
     <w:nsid w:val="764757C2"/>
     <w:multiLevelType w:val="multilevel"/>
     <w:tmpl w:val="D2440BB2"/>
@@ -3862,7 +4995,7 @@
       </w:pPr>
     </w:lvl>
   </w:abstractNum>
-  <w:abstractNum w:abstractNumId="12" w15:restartNumberingAfterBreak="0">
+  <w:abstractNum w:abstractNumId="16" w15:restartNumberingAfterBreak="0">
     <w:nsid w:val="77D16D0C"/>
     <w:multiLevelType w:val="hybridMultilevel"/>
     <w:tmpl w:val="69185904"/>
@@ -3975,7 +5108,7 @@
       </w:rPr>
     </w:lvl>
   </w:abstractNum>
-  <w:abstractNum w:abstractNumId="13" w15:restartNumberingAfterBreak="0">
+  <w:abstractNum w:abstractNumId="17" w15:restartNumberingAfterBreak="0">
     <w:nsid w:val="7F262DF9"/>
     <w:multiLevelType w:val="multilevel"/>
     <w:tmpl w:val="B8C6FE0A"/>
@@ -4125,46 +5258,58 @@
     </w:lvl>
   </w:abstractNum>
   <w:num w:numId="1">
+    <w:abstractNumId w:val="12"/>
+  </w:num>
+  <w:num w:numId="2">
+    <w:abstractNumId w:val="17"/>
+  </w:num>
+  <w:num w:numId="3">
+    <w:abstractNumId w:val="3"/>
+  </w:num>
+  <w:num w:numId="4">
+    <w:abstractNumId w:val="5"/>
+  </w:num>
+  <w:num w:numId="5">
     <w:abstractNumId w:val="9"/>
   </w:num>
-  <w:num w:numId="2">
+  <w:num w:numId="6">
+    <w:abstractNumId w:val="7"/>
+  </w:num>
+  <w:num w:numId="7">
     <w:abstractNumId w:val="13"/>
   </w:num>
-  <w:num w:numId="3">
-    <w:abstractNumId w:val="1"/>
-  </w:num>
-  <w:num w:numId="4">
-    <w:abstractNumId w:val="3"/>
-  </w:num>
-  <w:num w:numId="5">
-    <w:abstractNumId w:val="7"/>
-  </w:num>
-  <w:num w:numId="6">
-    <w:abstractNumId w:val="5"/>
-  </w:num>
-  <w:num w:numId="7">
-    <w:abstractNumId w:val="10"/>
-  </w:num>
   <w:num w:numId="8">
-    <w:abstractNumId w:val="2"/>
+    <w:abstractNumId w:val="4"/>
   </w:num>
   <w:num w:numId="9">
-    <w:abstractNumId w:val="11"/>
+    <w:abstractNumId w:val="15"/>
   </w:num>
   <w:num w:numId="10">
-    <w:abstractNumId w:val="12"/>
+    <w:abstractNumId w:val="16"/>
   </w:num>
   <w:num w:numId="11">
+    <w:abstractNumId w:val="8"/>
+  </w:num>
+  <w:num w:numId="12">
     <w:abstractNumId w:val="6"/>
   </w:num>
-  <w:num w:numId="12">
-    <w:abstractNumId w:val="4"/>
-  </w:num>
   <w:num w:numId="13">
-    <w:abstractNumId w:val="8"/>
+    <w:abstractNumId w:val="10"/>
   </w:num>
   <w:num w:numId="14">
     <w:abstractNumId w:val="0"/>
+  </w:num>
+  <w:num w:numId="15">
+    <w:abstractNumId w:val="2"/>
+  </w:num>
+  <w:num w:numId="16">
+    <w:abstractNumId w:val="11"/>
+  </w:num>
+  <w:num w:numId="17">
+    <w:abstractNumId w:val="14"/>
+  </w:num>
+  <w:num w:numId="18">
+    <w:abstractNumId w:val="1"/>
   </w:num>
 </w:numbering>
 </file>
@@ -4562,7 +5707,7 @@
   <w:style w:type="paragraph" w:default="1" w:styleId="Normal">
     <w:name w:val="Normal"/>
     <w:qFormat/>
-    <w:rsid w:val="008B2F03"/>
+    <w:rsid w:val="00B47C6E"/>
   </w:style>
   <w:style w:type="paragraph" w:styleId="Ttulo3">
     <w:name w:val="heading 3"/>

</xml_diff>